<commit_message>
feat: verso segue a instituição e o reconhecimento fica fixo
O trecho depois de ESTÁCIO DE usa o nome informado no cadastro, e o reconhecimento do curso deixa de ser um campo editável.

Co-authored-by: Cursor <cursoragent@cursor.com>
</commit_message>
<xml_diff>
--- a/public/templates/diploma-estacio.docx
+++ b/public/templates/diploma-estacio.docx
@@ -4836,17 +4836,17 @@
       </w:r>
       <w:r>
         <w:rPr/>
-        <w:t>RIBEIRÃO</w:t>
+        <w:t>{mantenedora_lugar}</w:t>
       </w:r>
       <w:r>
         <w:rPr>
           <w:spacing w:val="-5"/>
         </w:rPr>
-        <w:t> </w:t>
+        <w:t/>
       </w:r>
       <w:r>
         <w:rPr/>
-        <w:t>PRETO</w:t>
+        <w:t/>
       </w:r>
       <w:r>
         <w:rPr>
@@ -5415,7 +5415,8 @@
     <w:qFormat/>
     <w:pPr>
       <w:spacing w:before="66"/>
-      <w:ind w:left="6358" w:right="4148" w:hanging="1762"/>
+      <w:ind w:left="4372" w:right="4372"/>
+      <w:jc w:val="center"/>
       <w:outlineLvl w:val="1"/>
     </w:pPr>
     <w:rPr>

</xml_diff>